<commit_message>
added links and arranged the data in the files
</commit_message>
<xml_diff>
--- a/jpetstore/test_report.docx
+++ b/jpetstore/test_report.docx
@@ -206,6 +206,38 @@
         <w:rPr>
           <w:color w:val="002060"/>
         </w:rPr>
+        <w:t xml:space="preserve"> (</w:t>
+      </w:r>
+      <w:hyperlink r:id="rId6" w:history="1">
+        <w:r>
+          <w:rPr>
+            <w:rStyle w:val="Hyperlink"/>
+          </w:rPr>
+          <w:t>https://petstore.oct</w:t>
+        </w:r>
+        <w:r>
+          <w:rPr>
+            <w:rStyle w:val="Hyperlink"/>
+          </w:rPr>
+          <w:t>o</w:t>
+        </w:r>
+        <w:r>
+          <w:rPr>
+            <w:rStyle w:val="Hyperlink"/>
+          </w:rPr>
+          <w:t>perf.com</w:t>
+        </w:r>
+      </w:hyperlink>
+      <w:r>
+        <w:rPr>
+          <w:color w:val="002060"/>
+        </w:rPr>
+        <w:t>)</w:t>
+      </w:r>
+      <w:r>
+        <w:rPr>
+          <w:color w:val="002060"/>
+        </w:rPr>
         <w:t xml:space="preserve"> is a testing</w:t>
       </w:r>
       <w:r>
@@ -236,7 +268,15 @@
         <w:rPr>
           <w:color w:val="002060"/>
         </w:rPr>
-        <w:t>et products such as Birds, Dogs, Cats, Reptiles and Fish. It off</w:t>
+        <w:t>et products such as Birds, Dogs, Cats, Re</w:t>
+      </w:r>
+      <w:bookmarkStart w:id="0" w:name="_GoBack"/>
+      <w:bookmarkEnd w:id="0"/>
+      <w:r>
+        <w:rPr>
+          <w:color w:val="002060"/>
+        </w:rPr>
+        <w:t>ptiles and Fish. It off</w:t>
       </w:r>
       <w:r>
         <w:rPr>
@@ -594,13 +634,7 @@
         <w:rPr>
           <w:color w:val="002060"/>
         </w:rPr>
-        <w:t xml:space="preserve"> web portal</w:t>
-      </w:r>
-      <w:r>
-        <w:rPr>
-          <w:color w:val="002060"/>
-        </w:rPr>
-        <w:t xml:space="preserve"> </w:t>
+        <w:t xml:space="preserve"> web portal </w:t>
       </w:r>
       <w:r>
         <w:rPr>
@@ -5041,19 +5075,11 @@
         <w:t xml:space="preserve">The average of Average Response Time (ART) of all the transaction is 177.83 </w:t>
       </w:r>
       <w:proofErr w:type="spellStart"/>
-      <w:proofErr w:type="gramStart"/>
-      <w:r>
-        <w:rPr>
-          <w:color w:val="002060"/>
-        </w:rPr>
-        <w:t>ms</w:t>
-      </w:r>
-      <w:proofErr w:type="gramEnd"/>
-      <w:r>
-        <w:rPr>
-          <w:color w:val="002060"/>
-        </w:rPr>
-        <w:t>.</w:t>
+      <w:r>
+        <w:rPr>
+          <w:color w:val="002060"/>
+        </w:rPr>
+        <w:t>ms.</w:t>
       </w:r>
       <w:proofErr w:type="spellEnd"/>
       <w:r>
@@ -5213,7 +5239,7 @@
                     </pic:cNvPicPr>
                   </pic:nvPicPr>
                   <pic:blipFill>
-                    <a:blip r:embed="rId6" cstate="print">
+                    <a:blip r:embed="rId7" cstate="print">
                       <a:extLst>
                         <a:ext uri="{28A0092B-C50C-407E-A947-70E740481C1C}">
                           <a14:useLocalDpi xmlns:a14="http://schemas.microsoft.com/office/drawing/2010/main" val="0"/>
@@ -5344,7 +5370,7 @@
                     </pic:cNvPicPr>
                   </pic:nvPicPr>
                   <pic:blipFill>
-                    <a:blip r:embed="rId7" cstate="print">
+                    <a:blip r:embed="rId8" cstate="print">
                       <a:extLst>
                         <a:ext uri="{28A0092B-C50C-407E-A947-70E740481C1C}">
                           <a14:useLocalDpi xmlns:a14="http://schemas.microsoft.com/office/drawing/2010/main" val="0"/>
@@ -5504,7 +5530,7 @@
                     </pic:cNvPicPr>
                   </pic:nvPicPr>
                   <pic:blipFill>
-                    <a:blip r:embed="rId8" cstate="print">
+                    <a:blip r:embed="rId9" cstate="print">
                       <a:extLst>
                         <a:ext uri="{28A0092B-C50C-407E-A947-70E740481C1C}">
                           <a14:useLocalDpi xmlns:a14="http://schemas.microsoft.com/office/drawing/2010/main" val="0"/>
@@ -5637,7 +5663,7 @@
                     </pic:cNvPicPr>
                   </pic:nvPicPr>
                   <pic:blipFill>
-                    <a:blip r:embed="rId9" cstate="print">
+                    <a:blip r:embed="rId10" cstate="print">
                       <a:extLst>
                         <a:ext uri="{28A0092B-C50C-407E-A947-70E740481C1C}">
                           <a14:useLocalDpi xmlns:a14="http://schemas.microsoft.com/office/drawing/2010/main" val="0"/>
@@ -5727,13 +5753,7 @@
         <w:rPr>
           <w:color w:val="002060"/>
         </w:rPr>
-        <w:t>Each scenario contain multiple transactions in the workflow</w:t>
-      </w:r>
-      <w:r>
-        <w:rPr>
-          <w:color w:val="002060"/>
-        </w:rPr>
-        <w:t>, which hits the server. The average of transaction processed per second is 9.13</w:t>
+        <w:t>Each scenario contain multiple transactions in the workflow, which hits the server. The average of transaction processed per second is 9.13</w:t>
       </w:r>
       <w:r>
         <w:rPr>
@@ -5775,6 +5795,7 @@
       </w:pPr>
       <w:r>
         <w:rPr>
+          <w:noProof/>
           <w:color w:val="002060"/>
         </w:rPr>
         <w:drawing>
@@ -5793,7 +5814,7 @@
                     <pic:cNvPicPr/>
                   </pic:nvPicPr>
                   <pic:blipFill>
-                    <a:blip r:embed="rId10"/>
+                    <a:blip r:embed="rId11"/>
                     <a:stretch>
                       <a:fillRect/>
                     </a:stretch>
@@ -6237,8 +6258,6 @@
         </w:rPr>
         <w:t>. The response time of the plot was analyzed and plotted to check any deviation from the expected results.</w:t>
       </w:r>
-      <w:bookmarkStart w:id="0" w:name="_GoBack"/>
-      <w:bookmarkEnd w:id="0"/>
     </w:p>
     <w:sectPr>
       <w:pgSz w:w="12240" w:h="15840"/>
@@ -7546,6 +7565,29 @@
       <w:szCs w:val="24"/>
     </w:rPr>
   </w:style>
+  <w:style w:type="character" w:styleId="Hyperlink">
+    <w:name w:val="Hyperlink"/>
+    <w:basedOn w:val="DefaultParagraphFont"/>
+    <w:uiPriority w:val="99"/>
+    <w:unhideWhenUsed/>
+    <w:rsid w:val="00CD7A3F"/>
+    <w:rPr>
+      <w:color w:val="0563C1" w:themeColor="hyperlink"/>
+      <w:u w:val="single"/>
+    </w:rPr>
+  </w:style>
+  <w:style w:type="character" w:styleId="FollowedHyperlink">
+    <w:name w:val="FollowedHyperlink"/>
+    <w:basedOn w:val="DefaultParagraphFont"/>
+    <w:uiPriority w:val="99"/>
+    <w:semiHidden/>
+    <w:unhideWhenUsed/>
+    <w:rsid w:val="00CD7A3F"/>
+    <w:rPr>
+      <w:color w:val="954F72" w:themeColor="followedHyperlink"/>
+      <w:u w:val="single"/>
+    </w:rPr>
+  </w:style>
 </w:styles>
 </file>
 
@@ -7849,7 +7891,7 @@
 </file>
 
 <file path=customXml/itemProps1.xml><?xml version="1.0" encoding="utf-8"?>
-<ds:datastoreItem xmlns:ds="http://schemas.openxmlformats.org/officeDocument/2006/customXml" ds:itemID="{C2566F6F-F07D-4427-AD1B-36045020417F}">
+<ds:datastoreItem xmlns:ds="http://schemas.openxmlformats.org/officeDocument/2006/customXml" ds:itemID="{41455F89-F75A-4642-AFDD-1BC6F50DC207}">
   <ds:schemaRefs>
     <ds:schemaRef ds:uri="http://schemas.openxmlformats.org/officeDocument/2006/bibliography"/>
   </ds:schemaRefs>

</xml_diff>